<commit_message>
Công nợ khách hàng: khách còn nợ EPL bao nhiêu, gom mọi tháng
Rà chuỗi luồng hai DO từ lập phiếu gom → nhập kho → phiếu giao → xuất kho → khoá →
hoá đơn → thu / cấn trừ: từng bước đều có người làm và có tờ chứng từ, nhưng câu
"khách X còn nợ EPL bao nhiêu" chưa có chỗ nào trả lời trọn — bảng Theo dõi nói
từng phiếu, màn Hoá đơn gộp nói từng tờ, bảng Cấn trừ nói từng tháng.

Thêm GET /api/customers/{id}/cong-no và nút Công nợ ở màn Khách hàng: từng tờ
hoá đơn lẻ + hoá đơn gộp, đã thu, còn lại; tổng theo tiền của từng tờ và quy Kíp.
Đây là câu trả lời từ dữ liệu bên mình đã ghi, không phải sổ kế toán — bút toán
công nợ vẫn là bên anh Khang. Bãi không thấy (tiền bán). Bộ kiểm thu_chot_22_09
thêm phần 5 và chịu được trạng thái đã cấn trừ từ lần chạy trước.

Co-Authored-By: Claude Fable 5.1 <noreply@anthropic.com>
</commit_message>
<xml_diff>
--- a/DOCS/word/HUONG_DAN_THU_TUNG_VAI.docx
+++ b/DOCS/word/HUONG_DAN_THU_TUNG_VAI.docx
@@ -3606,6 +3606,83 @@
       </w:pPr>
       <w:r>
         <w:t xml:space="preserve">   - *Phải thấy:* ảnh hiện ngay ở khung, và ở danh sách tài xế thay cho hai chữ cái đầu.</w:t>
+      </w:r>
+    </w:p>
+    <w:p>
+      <w:pPr>
+        <w:pStyle w:val="ListNumber"/>
+      </w:pPr>
+      <w:r>
+        <w:rPr>
+          <w:rFonts w:ascii="Consolas" w:hAnsi="Consolas"/>
+          <w:sz w:val="19"/>
+        </w:rPr>
+        <w:t>doanhthu</w:t>
+      </w:r>
+      <w:r>
+        <w:t xml:space="preserve"> mở </w:t>
+      </w:r>
+      <w:r>
+        <w:rPr>
+          <w:b/>
+        </w:rPr>
+        <w:t>Khách hàng</w:t>
+      </w:r>
+      <w:r>
+        <w:t xml:space="preserve"> → nút </w:t>
+      </w:r>
+      <w:r>
+        <w:rPr>
+          <w:b/>
+        </w:rPr>
+        <w:t>Công nợ</w:t>
+      </w:r>
+      <w:r>
+        <w:t xml:space="preserve"> ở một khách: khối *Công nợ · tên khách* hiện số tờ hoá đơn,</w:t>
+      </w:r>
+    </w:p>
+    <w:p>
+      <w:pPr>
+        <w:jc w:val="both"/>
+      </w:pPr>
+      <w:r>
+        <w:t xml:space="preserve">   tổng đã xuất theo từng tiền, đã thu, </w:t>
+      </w:r>
+      <w:r>
+        <w:rPr>
+          <w:b/>
+        </w:rPr>
+        <w:t>còn nợ EPL</w:t>
+      </w:r>
+      <w:r>
+        <w:t xml:space="preserve"> (theo tiền hợp đồng, kèm quy Kíp) và từng tờ (hoá đơn</w:t>
+      </w:r>
+    </w:p>
+    <w:p>
+      <w:pPr>
+        <w:jc w:val="both"/>
+      </w:pPr>
+      <w:r>
+        <w:t xml:space="preserve">   phiếu lẫn hoá đơn gộp, bấm số tờ là mở). </w:t>
+      </w:r>
+      <w:r>
+        <w:rPr>
+          <w:rFonts w:ascii="Consolas" w:hAnsi="Consolas"/>
+          <w:sz w:val="19"/>
+        </w:rPr>
+        <w:t>thabok</w:t>
+      </w:r>
+      <w:r>
+        <w:t xml:space="preserve"> mở cùng màn: </w:t>
+      </w:r>
+      <w:r>
+        <w:rPr>
+          <w:b/>
+        </w:rPr>
+        <w:t>không có</w:t>
+      </w:r>
+      <w:r>
+        <w:t xml:space="preserve"> nút Công nợ.</w:t>
       </w:r>
     </w:p>
     <w:p>

</xml_diff>

<commit_message>
Sửa lỗi nghiêm trọng: vào màn Phiếu xuất xe không còn tự mở phiếu cũ ra sửa
Anh chủ dự án bắt được 22/09: bấm Phiếu xuất xe trên menu thì module tự nạp
phiếu mới nhất đang có (DS[0]) vào form — Bãi gõ là gõ đè lên tờ của chuyến khác,
mà phiếu là chứng từ tiền. Nay vào màn không kèm tham số: Bãi/Sếp (người lập)
thấy PHIẾU MỚI trắng với số mới; vai khác thấy ô chọn trống kèm câu nhắc, thân
phiếu giấu tới khi họ chọn tờ. Chỉ mở một tờ cụ thể khi người dùng chủ động chọn.

Kèm: EPL.di tới đúng địa chỉ đang đứng phải nạp lại khung — trình duyệt không
bắn hashchange nên nút "Tạo phiếu" bấm lần hai trước đây như nút chết.

Bộ kiểm giao diện thêm hai khẳng định: Bãi vào → số phiếu MỚI không trùng tờ nào
đang có; kế toán vào → không nạp sẵn, chọn một tờ thì mở đúng tờ đó.

Co-Authored-By: Claude Fable 5.1 <noreply@anthropic.com>
</commit_message>
<xml_diff>
--- a/DOCS/word/HUONG_DAN_THU_TUNG_VAI.docx
+++ b/DOCS/word/HUONG_DAN_THU_TUNG_VAI.docx
@@ -383,6 +383,70 @@
       </w:r>
       <w:r>
         <w:t xml:space="preserve"> là toàn bộ phần mới.</w:t>
+      </w:r>
+    </w:p>
+    <w:p>
+      <w:pPr>
+        <w:jc w:val="both"/>
+      </w:pPr>
+      <w:r>
+        <w:rPr>
+          <w:b/>
+        </w:rPr>
+        <w:t>Sửa 22/09 (lỗi anh bắt được):</w:t>
+      </w:r>
+      <w:r>
+        <w:t xml:space="preserve"> bấm vào </w:t>
+      </w:r>
+      <w:r>
+        <w:rPr>
+          <w:b/>
+        </w:rPr>
+        <w:t>Phiếu xuất xe</w:t>
+      </w:r>
+      <w:r>
+        <w:t xml:space="preserve"> trên menu </w:t>
+      </w:r>
+      <w:r>
+        <w:rPr>
+          <w:b/>
+        </w:rPr>
+        <w:t>không còn tự mở phiếu cũ mới nhất</w:t>
+      </w:r>
+      <w:r>
+        <w:t>.</w:t>
+      </w:r>
+    </w:p>
+    <w:p>
+      <w:pPr>
+        <w:jc w:val="both"/>
+      </w:pPr>
+      <w:r>
+        <w:rPr>
+          <w:rFonts w:ascii="Consolas" w:hAnsi="Consolas"/>
+          <w:sz w:val="19"/>
+        </w:rPr>
+        <w:t>thabok</w:t>
+      </w:r>
+      <w:r>
+        <w:t xml:space="preserve"> vào là thấy </w:t>
+      </w:r>
+      <w:r>
+        <w:rPr>
+          <w:b/>
+        </w:rPr>
+        <w:t>phiếu mới trắng</w:t>
+      </w:r>
+      <w:r>
+        <w:t xml:space="preserve"> với số mới; kế toán / quỹ vào thì ô chọn trống kèm câu nhắc, tự chọn</w:t>
+      </w:r>
+    </w:p>
+    <w:p>
+      <w:pPr>
+        <w:jc w:val="both"/>
+      </w:pPr>
+      <w:r>
+        <w:t>tờ cần xem — không ai gõ đè lên tờ của người khác nữa.</w:t>
       </w:r>
     </w:p>
     <w:p>

</xml_diff>

<commit_message>
Kịch bản test tay theo vai 24/09 (Markdown + Word), đánh dấu bản 22/09 là đã thay
- 13 tài khoản · 12 luồng xuyên vai · ma trận chặn quyền · kiểm chung UI (4 ngôn ngữ, zoom, Excel/PDF, điện thoại, mất mạng)
  · sổ kế toán 8030 · mẫu ghi lỗi · dọn dữ liệu sau khi test
- bản cũ bỏ lời khuyên seed.py --dung-lai (không được chạy trên epl_lao)

Co-Authored-By: Claude Opus 5.5 (1M context) <noreply@anthropic.com>
</commit_message>
<xml_diff>
--- a/DOCS/word/HUONG_DAN_THU_TUNG_VAI.docx
+++ b/DOCS/word/HUONG_DAN_THU_TUNG_VAI.docx
@@ -18,6 +18,31 @@
         <w:jc w:val="both"/>
       </w:pPr>
       <w:r>
+        <w:t xml:space="preserve">&gt; </w:t>
+      </w:r>
+      <w:r>
+        <w:rPr>
+          <w:b/>
+        </w:rPr>
+        <w:t>ĐÃ THAY bằng `KICH_BAN_TEST_TAY_THEO_VAI.md` (24/09/2026).</w:t>
+      </w:r>
+      <w:r>
+        <w:t xml:space="preserve"> Bản này dừng ở 22/09: còn ghi Bãi thấy tiền chi và thiếu</w:t>
+      </w:r>
+    </w:p>
+    <w:p>
+      <w:pPr>
+        <w:jc w:val="both"/>
+      </w:pPr>
+      <w:r>
+        <w:t>&gt; các phần mới. Giữ lại để tra cứu, đừng test theo bản này.</w:t>
+      </w:r>
+    </w:p>
+    <w:p>
+      <w:pPr>
+        <w:jc w:val="both"/>
+      </w:pPr>
+      <w:r>
         <w:t>Viết cho người thử phần mềm (anh chủ dự án, hoặc người demo cho khách). Cập nhật 22/09/2026 — sau ba đợt sửa theo trả lời của anh Khampla và đợt dọn nợ kỹ thuật.</w:t>
       </w:r>
     </w:p>
@@ -100,14 +125,6 @@
       </w:pPr>
       <w:r>
         <w:t>cd D:\Demo_Lao\EPL_LAO_REAL</w:t>
-      </w:r>
-    </w:p>
-    <w:p>
-      <w:pPr>
-        <w:jc w:val="both"/>
-      </w:pPr>
-      <w:r>
-        <w:t>python backend\app\seed.py --dung-lai      # gieo lại dữ liệu mẫu cho sạch (xoá hết, gieo lại)</w:t>
       </w:r>
     </w:p>
     <w:p>
@@ -8591,30 +8608,32 @@
       </w:pPr>
       <w:r>
         <w:rPr>
-          <w:rFonts w:ascii="Consolas" w:hAnsi="Consolas"/>
-          <w:sz w:val="19"/>
+          <w:b/>
         </w:rPr>
-        <w:t>`</w:t>
-      </w:r>
-    </w:p>
-    <w:p>
-      <w:pPr>
-        <w:jc w:val="both"/>
-      </w:pPr>
-      <w:r>
-        <w:t>python backend\app\seed.py --dung-lai</w:t>
-      </w:r>
-    </w:p>
-    <w:p>
-      <w:pPr>
-        <w:jc w:val="both"/>
-      </w:pPr>
+        <w:t>Không</w:t>
+      </w:r>
+      <w:r>
+        <w:t xml:space="preserve"> chạy </w:t>
+      </w:r>
       <w:r>
         <w:rPr>
           <w:rFonts w:ascii="Consolas" w:hAnsi="Consolas"/>
           <w:sz w:val="19"/>
         </w:rPr>
-        <w:t>`</w:t>
+        <w:t>seed.py --dung-lai</w:t>
+      </w:r>
+      <w:r>
+        <w:t xml:space="preserve"> trên DB </w:t>
+      </w:r>
+      <w:r>
+        <w:rPr>
+          <w:rFonts w:ascii="Consolas" w:hAnsi="Consolas"/>
+          <w:sz w:val="19"/>
+        </w:rPr>
+        <w:t>epl_lao</w:t>
+      </w:r>
+      <w:r>
+        <w:t>, nó xoá sạch cả dữ liệu mẫu tháng 9. Dọn dữ liệu thử bằng</w:t>
       </w:r>
     </w:p>
     <w:p>
@@ -8622,7 +8641,24 @@
         <w:jc w:val="both"/>
       </w:pPr>
       <w:r>
-        <w:t>Xoá sạch và gieo lại đúng bộ dữ liệu mẫu ban đầu. Chạy bất cứ lúc nào, không sợ hỏng gì.</w:t>
+        <w:rPr>
+          <w:rFonts w:ascii="Consolas" w:hAnsi="Consolas"/>
+          <w:sz w:val="19"/>
+        </w:rPr>
+        <w:t>python tools/don_rac_bo_kiem.py</w:t>
+      </w:r>
+      <w:r>
+        <w:t xml:space="preserve"> (xem trước) rồi </w:t>
+      </w:r>
+      <w:r>
+        <w:rPr>
+          <w:rFonts w:ascii="Consolas" w:hAnsi="Consolas"/>
+          <w:sz w:val="19"/>
+        </w:rPr>
+        <w:t>python tools/don_rac_bo_kiem.py that</w:t>
+      </w:r>
+      <w:r>
+        <w:t>, nhớ sao lưu trước.</w:t>
       </w:r>
     </w:p>
     <w:p>

</xml_diff>